<commit_message>
Remove header shading and bold from Part 2 table
Plain black-and-white table with no fill colour and no bold text,
to match the rest of the document.
</commit_message>
<xml_diff>
--- a/Pizza_Operator_Investigation_7.docx
+++ b/Pizza_Operator_Investigation_7.docx
@@ -5002,23 +5002,15 @@
     <w:p>
       <w:r>
         <w:rPr>
-          <w:b/>
           <w:sz w:val="22"/>
         </w:rPr>
-        <w:t xml:space="preserve">(i) </w:t>
-      </w:r>
-      <w:r>
-        <w:rPr>
-          <w:sz w:val="22"/>
-        </w:rPr>
-        <w:t>I make a spreadsheet with the headings the teacher give and fill in the data for Weeks 1 to 4. The Standard hourly rate is $15, the Overtime rate is 2 (means double) and the Rate per order is $0.80.</w:t>
+        <w:t>(i) I make a spreadsheet with the headings the teacher give and fill in the data for Weeks 1 to 4. The Standard hourly rate is $15, the Overtime rate is 2 (means double) and the Rate per order is $0.80.</w:t>
       </w:r>
     </w:p>
     <w:tbl>
       <w:tblPr>
         <w:tblStyle w:val="35"/>
         <w:tblW w:type="auto" w:w="0"/>
-        <w:jc w:val="center"/>
         <w:tblLook w:firstColumn="1" w:firstRow="1" w:lastColumn="0" w:lastRow="0" w:noHBand="0" w:noVBand="1" w:val="04A0"/>
       </w:tblPr>
       <w:tblGrid>
@@ -5036,7 +5028,6 @@
         <w:tc>
           <w:tcPr>
             <w:tcW w:type="dxa" w:w="1045"/>
-            <w:shd w:val="clear" w:color="auto" w:fill="D9E1F2"/>
             <w:tcBorders>
               <w:top w:val="single" w:sz="4" w:color="000000"/>
               <w:left w:val="single" w:sz="4" w:color="000000"/>
@@ -5051,7 +5042,6 @@
             <w:r/>
             <w:r>
               <w:rPr>
-                <w:b/>
                 <w:sz w:val="20"/>
               </w:rPr>
               <w:t>Week</w:t>
@@ -5061,7 +5051,6 @@
         <w:tc>
           <w:tcPr>
             <w:tcW w:type="dxa" w:w="1045"/>
-            <w:shd w:val="clear" w:color="auto" w:fill="D9E1F2"/>
             <w:tcBorders>
               <w:top w:val="single" w:sz="4" w:color="000000"/>
               <w:left w:val="single" w:sz="4" w:color="000000"/>
@@ -5076,7 +5065,6 @@
             <w:r/>
             <w:r>
               <w:rPr>
-                <w:b/>
                 <w:sz w:val="20"/>
               </w:rPr>
               <w:t>Standard hours worked</w:t>
@@ -5086,7 +5074,6 @@
         <w:tc>
           <w:tcPr>
             <w:tcW w:type="dxa" w:w="1045"/>
-            <w:shd w:val="clear" w:color="auto" w:fill="D9E1F2"/>
             <w:tcBorders>
               <w:top w:val="single" w:sz="4" w:color="000000"/>
               <w:left w:val="single" w:sz="4" w:color="000000"/>
@@ -5101,7 +5088,6 @@
             <w:r/>
             <w:r>
               <w:rPr>
-                <w:b/>
                 <w:sz w:val="20"/>
               </w:rPr>
               <w:t>Overtime hours worked</w:t>
@@ -5111,7 +5097,6 @@
         <w:tc>
           <w:tcPr>
             <w:tcW w:type="dxa" w:w="1045"/>
-            <w:shd w:val="clear" w:color="auto" w:fill="D9E1F2"/>
             <w:tcBorders>
               <w:top w:val="single" w:sz="4" w:color="000000"/>
               <w:left w:val="single" w:sz="4" w:color="000000"/>
@@ -5126,7 +5111,6 @@
             <w:r/>
             <w:r>
               <w:rPr>
-                <w:b/>
                 <w:sz w:val="20"/>
               </w:rPr>
               <w:t>Number of orders taken</w:t>
@@ -5136,7 +5120,6 @@
         <w:tc>
           <w:tcPr>
             <w:tcW w:type="dxa" w:w="1045"/>
-            <w:shd w:val="clear" w:color="auto" w:fill="D9E1F2"/>
             <w:tcBorders>
               <w:top w:val="single" w:sz="4" w:color="000000"/>
               <w:left w:val="single" w:sz="4" w:color="000000"/>
@@ -5151,7 +5134,6 @@
             <w:r/>
             <w:r>
               <w:rPr>
-                <w:b/>
                 <w:sz w:val="20"/>
               </w:rPr>
               <w:t>Standard hourly rate</w:t>
@@ -5161,7 +5143,6 @@
         <w:tc>
           <w:tcPr>
             <w:tcW w:type="dxa" w:w="1045"/>
-            <w:shd w:val="clear" w:color="auto" w:fill="D9E1F2"/>
             <w:tcBorders>
               <w:top w:val="single" w:sz="4" w:color="000000"/>
               <w:left w:val="single" w:sz="4" w:color="000000"/>
@@ -5176,7 +5157,6 @@
             <w:r/>
             <w:r>
               <w:rPr>
-                <w:b/>
                 <w:sz w:val="20"/>
               </w:rPr>
               <w:t>Overtime rate</w:t>
@@ -5186,7 +5166,6 @@
         <w:tc>
           <w:tcPr>
             <w:tcW w:type="dxa" w:w="1045"/>
-            <w:shd w:val="clear" w:color="auto" w:fill="D9E1F2"/>
             <w:tcBorders>
               <w:top w:val="single" w:sz="4" w:color="000000"/>
               <w:left w:val="single" w:sz="4" w:color="000000"/>
@@ -5201,7 +5180,6 @@
             <w:r/>
             <w:r>
               <w:rPr>
-                <w:b/>
                 <w:sz w:val="20"/>
               </w:rPr>
               <w:t>Rate per order taken</w:t>
@@ -5211,7 +5189,6 @@
         <w:tc>
           <w:tcPr>
             <w:tcW w:type="dxa" w:w="1045"/>
-            <w:shd w:val="clear" w:color="auto" w:fill="D9E1F2"/>
             <w:tcBorders>
               <w:top w:val="single" w:sz="4" w:color="000000"/>
               <w:left w:val="single" w:sz="4" w:color="000000"/>
@@ -5226,7 +5203,6 @@
             <w:r/>
             <w:r>
               <w:rPr>
-                <w:b/>
                 <w:sz w:val="20"/>
               </w:rPr>
               <w:t>Weekly wage</w:t>
@@ -5236,7 +5212,6 @@
         <w:tc>
           <w:tcPr>
             <w:tcW w:type="dxa" w:w="1045"/>
-            <w:shd w:val="clear" w:color="auto" w:fill="D9E1F2"/>
             <w:tcBorders>
               <w:top w:val="single" w:sz="4" w:color="000000"/>
               <w:left w:val="single" w:sz="4" w:color="000000"/>
@@ -5251,7 +5226,6 @@
             <w:r/>
             <w:r>
               <w:rPr>
-                <w:b/>
                 <w:sz w:val="20"/>
               </w:rPr>
               <w:t>Weekly piecework payment</w:t>
@@ -6100,22 +6074,14 @@
     <w:p>
       <w:r>
         <w:rPr>
-          <w:b/>
           <w:sz w:val="22"/>
         </w:rPr>
-        <w:t xml:space="preserve">(ii) </w:t>
-      </w:r>
-      <w:r>
-        <w:rPr>
-          <w:sz w:val="22"/>
-        </w:rPr>
-        <w:t>Using the spreadsheet formulae, the wage and piecework payment for each week, and the totals over the 4 weeks are calculated below. In the spreadsheet I put Week 1 in row 4, so the cell letters are B4 to I4.</w:t>
+        <w:t>(ii) Using the spreadsheet formulae, the wage and piecework payment for each week, and the totals over the 4 weeks are calculated below. In the spreadsheet I put Week 1 in row 4, so the cell letters are B4 to I4.</w:t>
       </w:r>
     </w:p>
     <w:p>
       <w:r>
         <w:rPr>
-          <w:b/>
           <w:sz w:val="22"/>
         </w:rPr>
         <w:t>Wage for each week</w:t>
@@ -6124,7 +6090,6 @@
     <w:p>
       <w:r>
         <w:rPr>
-          <w:b w:val="0"/>
           <w:sz w:val="22"/>
         </w:rPr>
         <w:t>Formula:  Weekly wage = Standard hours × Standard rate + Overtime hours × Standard rate × Overtime rate</w:t>
@@ -6133,7 +6098,6 @@
     <w:p>
       <w:r>
         <w:rPr>
-          <w:b w:val="0"/>
           <w:sz w:val="22"/>
         </w:rPr>
         <w:t>In Excel:  =B4*E4 + C4*E4*F4   (then fill down for Weeks 2 to 4)</w:t>
@@ -6142,7 +6106,6 @@
     <w:p>
       <w:r>
         <w:rPr>
-          <w:b w:val="0"/>
           <w:sz w:val="22"/>
         </w:rPr>
         <w:t>Week 1:  15 × 15 + 5 × 15 × 2 = 225 + 150 = $375.00</w:t>
@@ -6151,7 +6114,6 @@
     <w:p>
       <w:r>
         <w:rPr>
-          <w:b w:val="0"/>
           <w:sz w:val="22"/>
         </w:rPr>
         <w:t>Week 2:  15 × 15 + 3 × 15 × 2 = 225 + 90 = $315.00</w:t>
@@ -6160,7 +6122,6 @@
     <w:p>
       <w:r>
         <w:rPr>
-          <w:b w:val="0"/>
           <w:sz w:val="22"/>
         </w:rPr>
         <w:t>Week 3:  20 × 15 + 1.5 × 15 × 2 = 300 + 45 = $345.00</w:t>
@@ -6169,7 +6130,6 @@
     <w:p>
       <w:r>
         <w:rPr>
-          <w:b w:val="0"/>
           <w:sz w:val="22"/>
         </w:rPr>
         <w:t>Week 4:  12.5 × 15 + 6 × 15 × 2 = 187.50 + 180 = $367.50</w:t>
@@ -6179,7 +6139,6 @@
     <w:p>
       <w:r>
         <w:rPr>
-          <w:b/>
           <w:sz w:val="22"/>
         </w:rPr>
         <w:t>Piecework payment for each week</w:t>
@@ -6188,7 +6147,6 @@
     <w:p>
       <w:r>
         <w:rPr>
-          <w:b w:val="0"/>
           <w:sz w:val="22"/>
         </w:rPr>
         <w:t>Formula:  Weekly piecework payment = Number of orders × Rate per order</w:t>
@@ -6197,7 +6155,6 @@
     <w:p>
       <w:r>
         <w:rPr>
-          <w:b w:val="0"/>
           <w:sz w:val="22"/>
         </w:rPr>
         <w:t>In Excel:  =D4*G4   (then fill down for Weeks 2 to 4)</w:t>
@@ -6206,7 +6163,6 @@
     <w:p>
       <w:r>
         <w:rPr>
-          <w:b w:val="0"/>
           <w:sz w:val="22"/>
         </w:rPr>
         <w:t>Week 1:  400 × 0.80 = $320.00</w:t>
@@ -6215,7 +6171,6 @@
     <w:p>
       <w:r>
         <w:rPr>
-          <w:b w:val="0"/>
           <w:sz w:val="22"/>
         </w:rPr>
         <w:t>Week 2:  495 × 0.80 = $396.00</w:t>
@@ -6224,7 +6179,6 @@
     <w:p>
       <w:r>
         <w:rPr>
-          <w:b w:val="0"/>
           <w:sz w:val="22"/>
         </w:rPr>
         <w:t>Week 3:  530 × 0.80 = $424.00</w:t>
@@ -6233,7 +6187,6 @@
     <w:p>
       <w:r>
         <w:rPr>
-          <w:b w:val="0"/>
           <w:sz w:val="22"/>
         </w:rPr>
         <w:t>Week 4:  481 × 0.80 = $384.80</w:t>
@@ -6243,7 +6196,6 @@
     <w:p>
       <w:r>
         <w:rPr>
-          <w:b/>
           <w:sz w:val="22"/>
         </w:rPr>
         <w:t>Total wage over the 4 weeks</w:t>
@@ -6252,7 +6204,6 @@
     <w:p>
       <w:r>
         <w:rPr>
-          <w:b w:val="0"/>
           <w:sz w:val="22"/>
         </w:rPr>
         <w:t>Formula:  =SUM(H4:H7)</w:t>
@@ -6261,7 +6212,6 @@
     <w:p>
       <w:r>
         <w:rPr>
-          <w:b w:val="0"/>
           <w:sz w:val="22"/>
         </w:rPr>
         <w:t>Total wage = $375.00 + $315.00 + $345.00 + $367.50 = $1,402.50</w:t>
@@ -6271,7 +6221,6 @@
     <w:p>
       <w:r>
         <w:rPr>
-          <w:b/>
           <w:sz w:val="22"/>
         </w:rPr>
         <w:t>Total piecework payment over the 4 weeks</w:t>
@@ -6280,7 +6229,6 @@
     <w:p>
       <w:r>
         <w:rPr>
-          <w:b w:val="0"/>
           <w:sz w:val="22"/>
         </w:rPr>
         <w:t>Formula:  =SUM(I4:I7)</w:t>
@@ -6289,7 +6237,6 @@
     <w:p>
       <w:r>
         <w:rPr>
-          <w:b w:val="0"/>
           <w:sz w:val="22"/>
         </w:rPr>
         <w:t>Total piecework = $320.00 + $396.00 + $424.00 + $384.80 = $1,524.80</w:t>

</xml_diff>